<commit_message>
Update CV without AAAI venue disclosure
Replace the public CV Word file with the updated version.
</commit_message>
<xml_diff>
--- a/documents/cv.docx
+++ b/documents/cv.docx
@@ -240,15 +240,7 @@
           <w:sz w:val="22"/>
           <w:szCs w:val="22"/>
         </w:rPr>
-        <w:t>Sequential Fault Diagnosis and Distribution-Aware Predictive Maintenance</w:t>
-      </w:r>
-      <w:r>
-        <w:rPr>
-          <w:rFonts w:ascii="Times New Roman" w:hAnsi="Times New Roman"/>
-          <w:sz w:val="22"/>
-          <w:szCs w:val="22"/>
-        </w:rPr>
-        <w:t>,</w:t>
+        <w:t>Sequential Fault Diagnosis and Distribution-Aware Predictive Maintenance,</w:t>
       </w:r>
       <w:r>
         <w:rPr>
@@ -464,7 +456,7 @@
           <w:tab w:val="left" w:pos="2430"/>
         </w:tabs>
         <w:rPr>
-          <w:rFonts w:ascii="Times New Roman" w:hAnsi="Times New Roman" w:hint="eastAsia"/>
+          <w:rFonts w:ascii="Times New Roman" w:hAnsi="Times New Roman"/>
           <w:bCs/>
           <w:i/>
           <w:sz w:val="22"/>
@@ -742,7 +734,23 @@
           <w:i/>
           <w:iCs/>
         </w:rPr>
-        <w:t xml:space="preserve">Manuscript under review at AAAI 2027; short version under review at the </w:t>
+        <w:t>Manuscript under review at</w:t>
+      </w:r>
+      <w:r>
+        <w:rPr>
+          <w:rFonts w:ascii="Times New Roman" w:hAnsi="Times New Roman"/>
+          <w:i/>
+          <w:iCs/>
+        </w:rPr>
+        <w:t xml:space="preserve"> AI conference</w:t>
+      </w:r>
+      <w:r>
+        <w:rPr>
+          <w:rFonts w:ascii="Times New Roman" w:hAnsi="Times New Roman"/>
+          <w:i/>
+          <w:iCs/>
+        </w:rPr>
+        <w:t xml:space="preserve">; short version under review at the </w:t>
       </w:r>
       <w:proofErr w:type="spellStart"/>
       <w:r>
@@ -936,17 +944,7 @@
           <w:i/>
           <w:sz w:val="22"/>
         </w:rPr>
-        <w:t>Wonyoung</w:t>
-      </w:r>
-      <w:proofErr w:type="spellEnd"/>
-      <w:r>
-        <w:rPr>
-          <w:rFonts w:ascii="Times New Roman" w:hAnsi="Times New Roman"/>
-          <w:bCs/>
-          <w:i/>
-          <w:sz w:val="22"/>
-        </w:rPr>
-        <w:t xml:space="preserve"> Kim</w:t>
+        <w:t>Wonyoung Kim</w:t>
       </w:r>
     </w:p>
     <w:p>
@@ -995,7 +993,20 @@
           <w:sz w:val="22"/>
           <w:szCs w:val="22"/>
         </w:rPr>
-        <w:t>Dominant Arm Identification with Mixing and Recycling Observed Samples</w:t>
+        <w:t>D</w:t>
+      </w:r>
+      <w:proofErr w:type="spellEnd"/>
+      <w:r>
+        <w:rPr>
+          <w:rFonts w:ascii="Times New Roman" w:hAnsi="Times New Roman"/>
+          <w:b/>
+          <w:bCs/>
+          <w:i/>
+          <w:iCs/>
+          <w:sz w:val="22"/>
+          <w:szCs w:val="22"/>
+        </w:rPr>
+        <w:t>ominant Arm Identification with Mixing and Recycling Observed Samples</w:t>
       </w:r>
     </w:p>
     <w:p>
@@ -4237,13 +4248,7 @@
         <w:t>Latex</w:t>
       </w:r>
     </w:p>
-    <w:p>
-      <w:pPr>
-        <w:rPr>
-          <w:rFonts w:hint="eastAsia"/>
-        </w:rPr>
-      </w:pPr>
-    </w:p>
+    <w:p/>
     <w:sectPr>
       <w:pgSz w:w="11880" w:h="16820" w:code="9"/>
       <w:pgMar w:top="1440" w:right="1080" w:bottom="1440" w:left="1080" w:header="720" w:footer="720" w:gutter="0"/>
@@ -6654,6 +6659,7 @@
   <w:style w:type="character" w:default="1" w:styleId="a0">
     <w:name w:val="Default Paragraph Font"/>
     <w:uiPriority w:val="1"/>
+    <w:semiHidden/>
     <w:unhideWhenUsed/>
   </w:style>
   <w:style w:type="table" w:default="1" w:styleId="a1">

</xml_diff>